<commit_message>
update báo cáo tuần 1
</commit_message>
<xml_diff>
--- a/Tuan_1/Báo cáo tuần 1.docx
+++ b/Tuan_1/Báo cáo tuần 1.docx
@@ -592,15 +592,21 @@
         </w:rPr>
         <w:t>dđ</w:t>
       </w:r>
+    </w:p>
+    <w:p>
+      <w:pPr>
+        <w:rPr>
+          <w:rFonts w:ascii="Times New Roman" w:hAnsi="Times New Roman" w:cs="Times New Roman"/>
+        </w:rPr>
+      </w:pPr>
+      <w:r>
+        <w:rPr>
+          <w:rFonts w:ascii="Times New Roman" w:hAnsi="Times New Roman" w:cs="Times New Roman"/>
+        </w:rPr>
+        <w:t>dd</w:t>
+      </w:r>
       <w:bookmarkStart w:id="0" w:name="_GoBack"/>
       <w:bookmarkEnd w:id="0"/>
-    </w:p>
-    <w:p>
-      <w:pPr>
-        <w:rPr>
-          <w:rFonts w:ascii="Times New Roman" w:hAnsi="Times New Roman" w:cs="Times New Roman"/>
-        </w:rPr>
-      </w:pPr>
     </w:p>
     <w:sectPr>
       <w:pgSz w:w="12240" w:h="15840"/>

</xml_diff>